<commit_message>
Writeup done, issues with Qt on mac
</commit_message>
<xml_diff>
--- a/writeup/Sandy.docx
+++ b/writeup/Sandy.docx
@@ -197,6 +197,152 @@
           <w:szCs w:val="18"/>
         </w:rPr>
         <w:t xml:space="preserve">So, having realised all this, I created a GitHub Repo, with sub section. I will aim to experiment with network scanning next time. </w:t>
+      </w:r>
+      <w:r>
+        <w:rPr>
+          <w:rFonts w:ascii="Cambria" w:hAnsi="Cambria" w:cs="Apple Symbols"/>
+          <w:sz w:val="18"/>
+          <w:szCs w:val="18"/>
+        </w:rPr>
+        <w:br/>
+      </w:r>
+      <w:r>
+        <w:rPr>
+          <w:rFonts w:ascii="Cambria" w:hAnsi="Cambria" w:cs="Apple Symbols"/>
+          <w:sz w:val="18"/>
+          <w:szCs w:val="18"/>
+        </w:rPr>
+        <w:br/>
+      </w:r>
+      <w:r>
+        <w:rPr>
+          <w:rFonts w:ascii="Cambria" w:hAnsi="Cambria" w:cs="Apple Symbols"/>
+          <w:sz w:val="18"/>
+          <w:szCs w:val="18"/>
+        </w:rPr>
+        <w:br/>
+        <w:t xml:space="preserve">09/08/2026 – </w:t>
+      </w:r>
+      <w:r>
+        <w:rPr>
+          <w:rFonts w:ascii="Cambria" w:hAnsi="Cambria" w:cs="Apple Symbols"/>
+          <w:b/>
+          <w:bCs/>
+          <w:sz w:val="18"/>
+          <w:szCs w:val="18"/>
+        </w:rPr>
+        <w:t>familiarising myself with QT, and getting a grasp of how it will interact with my source code.</w:t>
+      </w:r>
+    </w:p>
+    <w:p>
+      <w:pPr>
+        <w:rPr>
+          <w:rFonts w:ascii="Cambria" w:hAnsi="Cambria" w:cs="Apple Symbols"/>
+          <w:sz w:val="18"/>
+          <w:szCs w:val="18"/>
+        </w:rPr>
+      </w:pPr>
+      <w:r>
+        <w:rPr>
+          <w:rFonts w:ascii="Cambria" w:hAnsi="Cambria" w:cs="Apple Symbols"/>
+          <w:sz w:val="18"/>
+          <w:szCs w:val="18"/>
+        </w:rPr>
+        <w:t xml:space="preserve">I realised early on that QT is not just a library. Following many online tutorials on how to simply get some sort of window popping up already showed me this would not be a simple task. However, after finally downloading and exploring Qt Creator (the IDE that comes with), I realised that building a graphical interface would be a lot simpler than I expected, as the IDE offers a ‘drag-and-drop’ style of GUI development. </w:t>
+      </w:r>
+      <w:r>
+        <w:rPr>
+          <w:rFonts w:ascii="Cambria" w:hAnsi="Cambria" w:cs="Apple Symbols"/>
+          <w:sz w:val="18"/>
+          <w:szCs w:val="18"/>
+        </w:rPr>
+        <w:br/>
+      </w:r>
+      <w:r>
+        <w:rPr>
+          <w:rFonts w:ascii="Cambria" w:hAnsi="Cambria" w:cs="Apple Symbols"/>
+          <w:sz w:val="18"/>
+          <w:szCs w:val="18"/>
+        </w:rPr>
+        <w:br/>
+        <w:t xml:space="preserve">I realise that ‘drag-and-drop’ is very Scratch like, and I quickly got worried that this would be illegal as per OCR’s guidelines. </w:t>
+      </w:r>
+      <w:proofErr w:type="gramStart"/>
+      <w:r>
+        <w:rPr>
+          <w:rFonts w:ascii="Cambria" w:hAnsi="Cambria" w:cs="Apple Symbols"/>
+          <w:sz w:val="18"/>
+          <w:szCs w:val="18"/>
+        </w:rPr>
+        <w:t>However</w:t>
+      </w:r>
+      <w:proofErr w:type="gramEnd"/>
+      <w:r>
+        <w:rPr>
+          <w:rFonts w:ascii="Cambria" w:hAnsi="Cambria" w:cs="Apple Symbols"/>
+          <w:sz w:val="18"/>
+          <w:szCs w:val="18"/>
+        </w:rPr>
+        <w:t xml:space="preserve"> I will reassure whoever is marking my NEA that the main heavy lifting of the project will be the backend, with several modules (as specified in a previous report) all acting together. Qt (and Qt Creator’s GUI builder) will only be used to create a nice visual for the user to interact with in order to send and receive files, as per the </w:t>
+      </w:r>
+      <w:proofErr w:type="gramStart"/>
+      <w:r>
+        <w:rPr>
+          <w:rFonts w:ascii="Cambria" w:hAnsi="Cambria" w:cs="Apple Symbols"/>
+          <w:sz w:val="18"/>
+          <w:szCs w:val="18"/>
+        </w:rPr>
+        <w:t>projects</w:t>
+      </w:r>
+      <w:proofErr w:type="gramEnd"/>
+      <w:r>
+        <w:rPr>
+          <w:rFonts w:ascii="Cambria" w:hAnsi="Cambria" w:cs="Apple Symbols"/>
+          <w:sz w:val="18"/>
+          <w:szCs w:val="18"/>
+        </w:rPr>
+        <w:t xml:space="preserve"> original goals.</w:t>
+      </w:r>
+      <w:r>
+        <w:rPr>
+          <w:rFonts w:ascii="Cambria" w:hAnsi="Cambria" w:cs="Apple Symbols"/>
+          <w:sz w:val="18"/>
+          <w:szCs w:val="18"/>
+        </w:rPr>
+        <w:br/>
+      </w:r>
+      <w:r>
+        <w:rPr>
+          <w:rFonts w:ascii="Cambria" w:hAnsi="Cambria" w:cs="Apple Symbols"/>
+          <w:sz w:val="18"/>
+          <w:szCs w:val="18"/>
+        </w:rPr>
+        <w:br/>
+        <w:t xml:space="preserve">That being said, today was a good day, I got a basic Qt program running, </w:t>
+      </w:r>
+      <w:r>
+        <w:rPr>
+          <w:rFonts w:ascii="Cambria" w:hAnsi="Cambria" w:cs="Apple Symbols"/>
+          <w:sz w:val="18"/>
+          <w:szCs w:val="18"/>
+        </w:rPr>
+        <w:t xml:space="preserve">narrowed down exactly how Qt will help with bringing this project together, and hope to spend the next few days learning more about Qt, and how I can use my future modules to seamlessly interact with Qt. </w:t>
+      </w:r>
+      <w:r>
+        <w:rPr>
+          <w:rFonts w:ascii="Cambria" w:hAnsi="Cambria" w:cs="Apple Symbols"/>
+          <w:sz w:val="18"/>
+          <w:szCs w:val="18"/>
+        </w:rPr>
+        <w:br/>
+      </w:r>
+      <w:r>
+        <w:rPr>
+          <w:rFonts w:ascii="Cambria" w:hAnsi="Cambria" w:cs="Apple Symbols"/>
+          <w:sz w:val="18"/>
+          <w:szCs w:val="18"/>
+        </w:rPr>
+        <w:br/>
       </w:r>
     </w:p>
     <w:p>

</xml_diff>